<commit_message>
chore(w03): pre-cleanup v2 backup for W03 transcripts
</commit_message>
<xml_diff>
--- a/交互产品开发/Output/21林昕+2023级+数字媒体艺术+影视班+《交互产品开发》+教学大纲.docx
+++ b/交互产品开发/Output/21林昕+2023级+数字媒体艺术+影视班+《交互产品开发》+教学大纲.docx
@@ -1221,7 +1221,7 @@
           <w:szCs w:val="24"/>
           <w:lang w:eastAsia="zh-CN"/>
         </w:rPr>
-        <w:t xml:space="preserve">本课程是数字媒体艺术专业的核心课程，定位为"AI 辅助的交互体验与系统设计"。课程有意识地剥离了传统重度后端的 SaaS 工程逻辑，转而聚焦于交互体验装置与单页面互动应用的开发。课程体系依托《Interaction Design》的认知科学框架，向下兼容《Lean UX》的模型验证与《About Face 4》的信息流构架，并引入 Vibe Coding 理念，让学生借助前沿 AI 代码生成工具 (如 v0、CodeGeeX)，跨越前端工程门槛，独立完成从痛点洞察、高保真状态机构筑到体验式前端输出的闭环。</w:t>
+        <w:t xml:space="preserve">本课程是数字媒体艺术专业的核心课程，定位为"AI 辅助的交互体验与系统设计"。课程有意识地剥离了传统重度后端的 SaaS 工程逻辑，转而聚焦于交互体验装置与单页面互动应用的开发。课程体系依托《Interaction Design》的认知科学框架，向下兼容《Lean UX》的模型验证与《About Face 4》的信息流构架，并引入 Vibe Coding 理念与实操，让学生借助前沿 AI 代码生成工具 (如 v0、CodeGeeX)，跨越前端工程门槛，独立完成从痛点洞察、高保真状态机构筑到体验式前端输出的闭环。</w:t>
       </w:r>
     </w:p>
     <w:p>
@@ -1278,7 +1278,7 @@
           <w:szCs w:val="24"/>
           <w:lang w:eastAsia="zh-CN"/>
         </w:rPr>
-        <w:t xml:space="preserve">课程采用强设定的"1主线+4实验"模式，贯穿15周教学。以"交互单页面体验应用"为项目驱动核心，摒弃假大空的文档撰写，注重"假设驱动"的敏捷落地方孔。教学过程通过"周理论输入 -&gt; 周课内实战 -&gt; 阶段性实验验收"的节奏，最终通过极简的 AI 工具生成可交互的前沿动效静态雏形，并在教室内完成基于启发式走查与出声思考法的同侪可用性测试评估。</w:t>
+        <w:t xml:space="preserve">课程采用强设定的"1主线+4实验"模式，贯穿15周教学。以"交互单页面体验应用"为项目驱动核心，摒弃假大空的文档撰写，注重"假设驱动"的敏捷落地方孔。教学过程通过"周实操导引 -&gt; 周课内实战 -&gt; 阶段性实验验收"的节奏，最终通过极简的 AI 工具生成可交互的前沿动效静态雏形，并在教室内完成基于启发式走查与出声思考法的同侪可用性测试评估。</w:t>
       </w:r>
     </w:p>
     <w:p>
@@ -1636,7 +1636,7 @@
           <w:szCs w:val="24"/>
           <w:lang w:eastAsia="zh-CN"/>
         </w:rPr>
-        <w:t xml:space="preserve">项目一  交互体系概论基础</w:t>
+        <w:t xml:space="preserve">第1章  交互体系概论基础</w:t>
       </w:r>
     </w:p>
     <w:p>
@@ -1681,7 +1681,7 @@
           <w:szCs w:val="24"/>
           <w:lang w:eastAsia="zh-CN"/>
         </w:rPr>
-        <w:t xml:space="preserve">1.1 交互与UX的本质定义；可用性与体验目标</w:t>
+        <w:t xml:space="preserve">1.1 交互与UX的概念与实际运用；可用性与体验目标</w:t>
       </w:r>
     </w:p>
     <w:p>
@@ -1885,7 +1885,7 @@
           <w:szCs w:val="24"/>
           <w:lang w:eastAsia="zh-CN"/>
         </w:rPr>
-        <w:t xml:space="preserve">理论讲授、案例分析、产品逆向体验拆解小组实战</w:t>
+        <w:t xml:space="preserve">项目导引、案例分析、产品逆向体验拆解小组实战</w:t>
       </w:r>
     </w:p>
     <w:p>
@@ -1994,7 +1994,7 @@
           <w:szCs w:val="24"/>
           <w:lang w:eastAsia="zh-CN"/>
         </w:rPr>
-        <w:t xml:space="preserve">项目二  人类认知与心智摩擦</w:t>
+        <w:t xml:space="preserve">第2章  人类认知与心智摩擦</w:t>
       </w:r>
     </w:p>
     <w:p>
@@ -2039,7 +2039,7 @@
           <w:szCs w:val="24"/>
           <w:lang w:eastAsia="zh-CN"/>
         </w:rPr>
-        <w:t xml:space="preserve">2.1 认知框架与记忆负荷；心智模型与界面隐喻</w:t>
+        <w:t xml:space="preserve">2.1 认知框架与记忆负荷优化实践；心智模型与界面隐喻</w:t>
       </w:r>
     </w:p>
     <w:p>
@@ -2243,7 +2243,7 @@
           <w:szCs w:val="24"/>
           <w:lang w:eastAsia="zh-CN"/>
         </w:rPr>
-        <w:t xml:space="preserve">理论讲授、白板推演、热力图认知分析实践</w:t>
+        <w:t xml:space="preserve">项目导引、白板推演、热力图认知分析实践</w:t>
       </w:r>
     </w:p>
     <w:p>
@@ -2352,7 +2352,7 @@
           <w:szCs w:val="24"/>
           <w:lang w:eastAsia="zh-CN"/>
         </w:rPr>
-        <w:t xml:space="preserve">项目三  产品洞察与痛点切入</w:t>
+        <w:t xml:space="preserve">第3章  产品洞察与痛点切入</w:t>
       </w:r>
     </w:p>
     <w:p>
@@ -2601,7 +2601,7 @@
           <w:szCs w:val="24"/>
           <w:lang w:eastAsia="zh-CN"/>
         </w:rPr>
-        <w:t xml:space="preserve">理论讲授、访谈技巧示范、微调研方案设计实录</w:t>
+        <w:t xml:space="preserve">项目导引、访谈技巧示范、微调研方案设计实录</w:t>
       </w:r>
     </w:p>
     <w:p>
@@ -2710,7 +2710,7 @@
           <w:szCs w:val="24"/>
           <w:lang w:eastAsia="zh-CN"/>
         </w:rPr>
-        <w:t xml:space="preserve">项目四  假设驱动与MVP构建</w:t>
+        <w:t xml:space="preserve">第4章  假设驱动与MVP构建</w:t>
       </w:r>
     </w:p>
     <w:p>
@@ -2959,7 +2959,7 @@
           <w:szCs w:val="24"/>
           <w:lang w:eastAsia="zh-CN"/>
         </w:rPr>
-        <w:t xml:space="preserve">理论讲授、案例复盘、MVP 清单讨论与决策</w:t>
+        <w:t xml:space="preserve">项目导引、案例复盘、MVP 清单讨论与决策</w:t>
       </w:r>
     </w:p>
     <w:p>
@@ -3068,7 +3068,7 @@
           <w:szCs w:val="24"/>
           <w:lang w:eastAsia="zh-CN"/>
         </w:rPr>
-        <w:t xml:space="preserve">项目五  目标导向路径与架构</w:t>
+        <w:t xml:space="preserve">第5章  目标导向路径与架构</w:t>
       </w:r>
     </w:p>
     <w:p>
@@ -3317,7 +3317,7 @@
           <w:szCs w:val="24"/>
           <w:lang w:eastAsia="zh-CN"/>
         </w:rPr>
-        <w:t xml:space="preserve">理论讲授、系统蓝图拆解、状态机白板绘图实操</w:t>
+        <w:t xml:space="preserve">项目导引、系统蓝图拆解、状态机白板绘图实操</w:t>
       </w:r>
     </w:p>
     <w:p>
@@ -3426,7 +3426,7 @@
           <w:szCs w:val="24"/>
           <w:lang w:eastAsia="zh-CN"/>
         </w:rPr>
-        <w:t xml:space="preserve">项目六  容器工程化基础映射</w:t>
+        <w:t xml:space="preserve">第6章  容器工程化基础映射</w:t>
       </w:r>
     </w:p>
     <w:p>
@@ -3675,7 +3675,7 @@
           <w:szCs w:val="24"/>
           <w:lang w:eastAsia="zh-CN"/>
         </w:rPr>
-        <w:t xml:space="preserve">理论讲授、设计系统工程化演示、Figma 容器搭建测验</w:t>
+        <w:t xml:space="preserve">项目导引、设计系统工程化演示、Figma 容器搭建测验</w:t>
       </w:r>
     </w:p>
     <w:p>
@@ -3784,7 +3784,7 @@
           <w:szCs w:val="24"/>
           <w:lang w:eastAsia="zh-CN"/>
         </w:rPr>
-        <w:t xml:space="preserve">项目七  视觉重构：层级与色彩</w:t>
+        <w:t xml:space="preserve">第7章  视觉重构：层级与色彩</w:t>
       </w:r>
     </w:p>
     <w:p>
@@ -4033,7 +4033,7 @@
           <w:szCs w:val="24"/>
           <w:lang w:eastAsia="zh-CN"/>
         </w:rPr>
-        <w:t xml:space="preserve">理论讲授、重构对比赏析、视觉 Token 系统推演实践</w:t>
+        <w:t xml:space="preserve">项目导引、重构对比赏析、视觉 Token 系统推演实践</w:t>
       </w:r>
     </w:p>
     <w:p>
@@ -4142,7 +4142,7 @@
           <w:szCs w:val="24"/>
           <w:lang w:eastAsia="zh-CN"/>
         </w:rPr>
-        <w:t xml:space="preserve">项目八  视觉重构：深度与防错</w:t>
+        <w:t xml:space="preserve">第8章  视觉重构：深度与防错</w:t>
       </w:r>
     </w:p>
     <w:p>
@@ -4187,7 +4187,7 @@
           <w:szCs w:val="24"/>
           <w:lang w:eastAsia="zh-CN"/>
         </w:rPr>
-        <w:t xml:space="preserve">8.1 光影深度营造原则；处理极限/错误边界与情境反馈</w:t>
+        <w:t xml:space="preserve">8.1 光影深度营造实操；处理极限/错误边界与情境反馈</w:t>
       </w:r>
     </w:p>
     <w:p>
@@ -4391,7 +4391,7 @@
           <w:szCs w:val="24"/>
           <w:lang w:eastAsia="zh-CN"/>
         </w:rPr>
-        <w:t xml:space="preserve">理论讲授、边缘错误案例分析、防错页面设计实操</w:t>
+        <w:t xml:space="preserve">项目导引、边缘错误案例分析、防错页面设计实操</w:t>
       </w:r>
     </w:p>
     <w:p>
@@ -4500,7 +4500,7 @@
           <w:szCs w:val="24"/>
           <w:lang w:eastAsia="zh-CN"/>
         </w:rPr>
-        <w:t xml:space="preserve">项目九  AI 原型协作结构化</w:t>
+        <w:t xml:space="preserve">第9章  AI 原型协作结构化</w:t>
       </w:r>
     </w:p>
     <w:p>
@@ -4545,7 +4545,7 @@
           <w:szCs w:val="24"/>
           <w:lang w:eastAsia="zh-CN"/>
         </w:rPr>
-        <w:t xml:space="preserve">9.1 大语言模型的人机协同系统架构法；界面生成 Prompt 工程</w:t>
+        <w:t xml:space="preserve">9.1 大语言模型的人机协同系统架构应用；界面生成 Prompt 工程</w:t>
       </w:r>
     </w:p>
     <w:p>
@@ -4653,7 +4653,7 @@
           <w:szCs w:val="24"/>
           <w:lang w:eastAsia="zh-CN"/>
         </w:rPr>
-        <w:t xml:space="preserve">Vibe Coding 理念：基于确定的视觉/逻辑基座，向大模型输出结构化 Prompt</w:t>
+        <w:t xml:space="preserve">Vibe Coding 理念与实操：基于确定的视觉/逻辑基座，向大模型输出结构化 Prompt</w:t>
       </w:r>
     </w:p>
     <w:p>
@@ -4749,7 +4749,7 @@
           <w:szCs w:val="24"/>
           <w:lang w:eastAsia="zh-CN"/>
         </w:rPr>
-        <w:t xml:space="preserve">理论讲授、AI 生成翻车案例排雷、结构化 Prompt 演练</w:t>
+        <w:t xml:space="preserve">项目导引、AI 生成翻车案例排雷、结构化 Prompt 演练</w:t>
       </w:r>
     </w:p>
     <w:p>
@@ -4858,7 +4858,7 @@
           <w:szCs w:val="24"/>
           <w:lang w:eastAsia="zh-CN"/>
         </w:rPr>
-        <w:t xml:space="preserve">项目十  前沿动效组件融入</w:t>
+        <w:t xml:space="preserve">第10章  前沿动效组件融入</w:t>
       </w:r>
     </w:p>
     <w:p>
@@ -4903,7 +4903,7 @@
           <w:szCs w:val="24"/>
           <w:lang w:eastAsia="zh-CN"/>
         </w:rPr>
-        <w:t xml:space="preserve">10.1 前端交互特效融合机制；微观反馈的理论支撑</w:t>
+        <w:t xml:space="preserve">10.1 前端交互特效融合机制与实操；微观反馈的理论支撑</w:t>
       </w:r>
     </w:p>
     <w:p>
@@ -5107,7 +5107,7 @@
           <w:szCs w:val="24"/>
           <w:lang w:eastAsia="zh-CN"/>
         </w:rPr>
-        <w:t xml:space="preserve">理论讲授、优秀动效组件赏析、AI 驱动特效接入实拍</w:t>
+        <w:t xml:space="preserve">项目导引、优秀动效组件赏析、AI 驱动特效接入实拍</w:t>
       </w:r>
     </w:p>
     <w:p>
@@ -5216,7 +5216,7 @@
           <w:szCs w:val="24"/>
           <w:lang w:eastAsia="zh-CN"/>
         </w:rPr>
-        <w:t xml:space="preserve">项目十一  逻辑排障与兜底策略</w:t>
+        <w:t xml:space="preserve">第11章  逻辑排障与兜底策略</w:t>
       </w:r>
     </w:p>
     <w:p>
@@ -5465,7 +5465,7 @@
           <w:szCs w:val="24"/>
           <w:lang w:eastAsia="zh-CN"/>
         </w:rPr>
-        <w:t xml:space="preserve">理论讲授、重度 Bug 抢救实演、混合保真兜底演练</w:t>
+        <w:t xml:space="preserve">项目导引、重度 Bug 抢救实演、混合保真兜底演练</w:t>
       </w:r>
     </w:p>
     <w:p>
@@ -5574,7 +5574,7 @@
           <w:szCs w:val="24"/>
           <w:lang w:eastAsia="zh-CN"/>
         </w:rPr>
-        <w:t xml:space="preserve">项目十二  启发式评估原理与应用</w:t>
+        <w:t xml:space="preserve">第12章  启发式评估原理与应用</w:t>
       </w:r>
     </w:p>
     <w:p>
@@ -5619,7 +5619,7 @@
           <w:szCs w:val="24"/>
           <w:lang w:eastAsia="zh-CN"/>
         </w:rPr>
-        <w:t xml:space="preserve">12.1 可用性客观评估标准引入；Nielsen十大可用性真理</w:t>
+        <w:t xml:space="preserve">12.1 可用性客观评估标准实战导入；Nielsen十大可用性真理</w:t>
       </w:r>
     </w:p>
     <w:p>
@@ -5823,7 +5823,7 @@
           <w:szCs w:val="24"/>
           <w:lang w:eastAsia="zh-CN"/>
         </w:rPr>
-        <w:t xml:space="preserve">理论讲授、对照打分示范、各组互换原型进行专家检验</w:t>
+        <w:t xml:space="preserve">项目导引、对照打分示范、各组互换原型进行专家检验</w:t>
       </w:r>
     </w:p>
     <w:p>
@@ -5932,7 +5932,7 @@
           <w:szCs w:val="24"/>
           <w:lang w:eastAsia="zh-CN"/>
         </w:rPr>
-        <w:t xml:space="preserve">项目十三  对话与可操作测试法</w:t>
+        <w:t xml:space="preserve">第13章  对话与可操作测试法</w:t>
       </w:r>
     </w:p>
     <w:p>
@@ -6181,7 +6181,7 @@
           <w:szCs w:val="24"/>
           <w:lang w:eastAsia="zh-CN"/>
         </w:rPr>
-        <w:t xml:space="preserve">理论讲授、主持过程正反面情景重现、实地组编组下放测试</w:t>
+        <w:t xml:space="preserve">项目导引、主持过程正反面情景重现、实地组编组下放测试</w:t>
       </w:r>
     </w:p>
     <w:p>
@@ -6290,7 +6290,7 @@
           <w:szCs w:val="24"/>
           <w:lang w:eastAsia="zh-CN"/>
         </w:rPr>
-        <w:t xml:space="preserve">项目十四  数据复盘与作品库凝练</w:t>
+        <w:t xml:space="preserve">第14章  数据复盘与作品库凝练</w:t>
       </w:r>
     </w:p>
     <w:p>
@@ -6539,7 +6539,7 @@
           <w:szCs w:val="24"/>
           <w:lang w:eastAsia="zh-CN"/>
         </w:rPr>
-        <w:t xml:space="preserve">理论讲授、作品集结构剖析、数据归纳实操、展板撰写辅导</w:t>
+        <w:t xml:space="preserve">项目导引、作品集结构剖析、数据归纳实操、展板撰写辅导</w:t>
       </w:r>
     </w:p>
     <w:p>
@@ -6648,7 +6648,7 @@
           <w:szCs w:val="24"/>
           <w:lang w:eastAsia="zh-CN"/>
         </w:rPr>
-        <w:t xml:space="preserve">项目十五  课程综合路演检查</w:t>
+        <w:t xml:space="preserve">第15章  课程综合路演检查</w:t>
       </w:r>
     </w:p>
     <w:p>

</xml_diff>